<commit_message>
docs: trim client checklist to just Apple + Google Play
RevenueCat doesn't need to be client-owned from day one -- it never
touches money (Apple/Google handle billing and payouts directly into
App Store Connect / Play Console), and its sandbox testing is free and
unlimited once those two developer accounts exist. Set it up under my
own account like Supabase, transfer at final delivery.

Co-Authored-By: Claude Sonnet 5 <noreply@anthropic.com>
</commit_message>
<xml_diff>
--- a/docs/client-handoff/client-setup-checklist.docx
+++ b/docs/client-handoff/client-setup-checklist.docx
@@ -39,7 +39,7 @@
           <w:color w:val="221B14"/>
           <w:sz w:val="22"/>
         </w:rPr>
-        <w:t>Three accounts need to exist under your business, not mine, because each one needs a payment method and, eventually, real subscription revenue flowing through it. I can't set these up on your behalf — they need to be tied to your card and your business identity from day one so there's nothing to untangle later.</w:t>
+        <w:t>Two accounts need to exist under your business, not mine, because each one needs a payment method tied to your card and your business identity from day one. Everything else the app depends on — including the subscription system itself — I can set up on my end and hand over ownership of at delivery, the same way I'm already doing with the backend.</w:t>
       </w:r>
     </w:p>
     <w:p>
@@ -53,7 +53,7 @@
           <w:color w:val="221B14"/>
           <w:sz w:val="22"/>
         </w:rPr>
-        <w:t>For each one: what it costs, where to set it up, the exact steps, and exactly what to send back to me once it's done. Start with the first two — Apple and Google Play — since the third one (RevenueCat) connects to both of them and can't be fully set up until they're approved.</w:t>
+        <w:t>For each one below: what it costs, where to set it up, the exact steps, and exactly what to send back to me once it's done. Start these as early as possible — they're the only things on the critical path that I can't move forward without.</w:t>
       </w:r>
     </w:p>
     <w:p>
@@ -226,63 +226,7 @@
           </w:p>
         </w:tc>
       </w:tr>
-      <w:tr>
-        <w:tc>
-          <w:tcPr>
-            <w:tcW w:type="dxa" w:w="3216"/>
-          </w:tcPr>
-          <w:p>
-            <w:r>
-              <w:rPr>
-                <w:b/>
-                <w:sz w:val="20"/>
-              </w:rPr>
-              <w:t>3. RevenueCat account</w:t>
-            </w:r>
-          </w:p>
-        </w:tc>
-        <w:tc>
-          <w:tcPr>
-            <w:tcW w:type="dxa" w:w="3216"/>
-          </w:tcPr>
-          <w:p>
-            <w:r>
-              <w:rPr>
-                <w:sz w:val="20"/>
-              </w:rPr>
-              <w:t>Free to set up*</w:t>
-            </w:r>
-          </w:p>
-        </w:tc>
-        <w:tc>
-          <w:tcPr>
-            <w:tcW w:type="dxa" w:w="3216"/>
-          </w:tcPr>
-          <w:p>
-            <w:r>
-              <w:rPr>
-                <w:sz w:val="20"/>
-              </w:rPr>
-              <w:t>Handling real subscription payments</w:t>
-            </w:r>
-          </w:p>
-        </w:tc>
-      </w:tr>
     </w:tbl>
-    <w:p>
-      <w:pPr>
-        <w:spacing w:after="0" w:before="120"/>
-      </w:pPr>
-      <w:r>
-        <w:rPr>
-          <w:b w:val="0"/>
-          <w:i w:val="0"/>
-          <w:color w:val="6F6252"/>
-          <w:sz w:val="19"/>
-        </w:rPr>
-        <w:t>* RevenueCat itself doesn't charge anything to set up or at this app's size — but it's where your subscribers' payments get tracked and where you'll eventually add your payout bank details, so the account has to be yours, not mine.</w:t>
-      </w:r>
-    </w:p>
     <w:p>
       <w:r>
         <w:br w:type="page"/>
@@ -358,7 +302,7 @@
           <w:color w:val="221B14"/>
           <w:sz w:val="21"/>
         </w:rPr>
-        <w:t>Submitting the iPhone app to the App Store, "Sign in with Apple" login, and letting RevenueCat verify Apple subscription payments</w:t>
+        <w:t>Submitting the iPhone app to the App Store, "Sign in with Apple" login, and letting the subscription system verify Apple purchases</w:t>
       </w:r>
     </w:p>
     <w:p>
@@ -626,7 +570,7 @@
           <w:color w:val="221B14"/>
           <w:sz w:val="21"/>
         </w:rPr>
-        <w:t>Submitting the Android app to Google Play, and setting up Google Play Billing so RevenueCat can process Android subscription payments</w:t>
+        <w:t>Submitting the Android app to Google Play, and setting up Google Play Billing so the subscription system can process Android purchases</w:t>
       </w:r>
     </w:p>
     <w:p>
@@ -812,244 +756,6 @@
       </w:r>
     </w:p>
     <w:p>
-      <w:r>
-        <w:br w:type="page"/>
-      </w:r>
-    </w:p>
-    <w:p>
-      <w:pPr>
-        <w:spacing w:before="360" w:after="40"/>
-      </w:pPr>
-      <w:r>
-        <w:rPr>
-          <w:b/>
-          <w:color w:val="B0501C"/>
-          <w:sz w:val="30"/>
-        </w:rPr>
-        <w:t>3.  RevenueCat account</w:t>
-      </w:r>
-    </w:p>
-    <w:p>
-      <w:pPr>
-        <w:spacing w:after="120"/>
-      </w:pPr>
-      <w:r>
-        <w:rPr>
-          <w:b/>
-          <w:color w:val="6F6252"/>
-          <w:sz w:val="21"/>
-        </w:rPr>
-        <w:t xml:space="preserve">Cost: </w:t>
-      </w:r>
-      <w:r>
-        <w:rPr>
-          <w:color w:val="221B14"/>
-          <w:sz w:val="21"/>
-        </w:rPr>
-        <w:t>Free to create and free to run at this app's size (their free tier covers meaningful subscriber volume before any fee kicks in)</w:t>
-      </w:r>
-    </w:p>
-    <w:p>
-      <w:pPr>
-        <w:spacing w:after="120"/>
-      </w:pPr>
-      <w:r>
-        <w:rPr>
-          <w:b/>
-          <w:color w:val="6F6252"/>
-          <w:sz w:val="21"/>
-        </w:rPr>
-        <w:t xml:space="preserve">Website: </w:t>
-      </w:r>
-      <w:r>
-        <w:rPr>
-          <w:color w:val="221B14"/>
-          <w:sz w:val="21"/>
-        </w:rPr>
-        <w:t>app.revenuecat.com</w:t>
-      </w:r>
-    </w:p>
-    <w:p>
-      <w:pPr>
-        <w:spacing w:after="120"/>
-      </w:pPr>
-      <w:r>
-        <w:rPr>
-          <w:b/>
-          <w:color w:val="6F6252"/>
-          <w:sz w:val="21"/>
-        </w:rPr>
-        <w:t xml:space="preserve">Needed for: </w:t>
-      </w:r>
-      <w:r>
-        <w:rPr>
-          <w:color w:val="221B14"/>
-          <w:sz w:val="21"/>
-        </w:rPr>
-        <w:t>The actual subscription/paywall system — this is Week 3 build work, but the account needs to be created under your ownership since it's directly tied to your subscribers' payments and, eventually, your payout bank account</w:t>
-      </w:r>
-    </w:p>
-    <w:p>
-      <w:pPr>
-        <w:spacing w:after="120"/>
-      </w:pPr>
-      <w:r>
-        <w:rPr>
-          <w:b/>
-          <w:color w:val="6F6252"/>
-          <w:sz w:val="21"/>
-        </w:rPr>
-        <w:t xml:space="preserve">When: </w:t>
-      </w:r>
-      <w:r>
-        <w:rPr>
-          <w:color w:val="221B14"/>
-          <w:sz w:val="21"/>
-        </w:rPr>
-        <w:t>Can wait until items 1 &amp; 2 above are approved — RevenueCat needs both stores connected before it can do anything</w:t>
-      </w:r>
-    </w:p>
-    <w:p>
-      <w:pPr>
-        <w:spacing w:before="200" w:after="40"/>
-      </w:pPr>
-      <w:r>
-        <w:rPr>
-          <w:b/>
-          <w:color w:val="221B14"/>
-          <w:sz w:val="22"/>
-        </w:rPr>
-        <w:t>Steps (once Apple &amp; Google Play are approved)</w:t>
-      </w:r>
-    </w:p>
-    <w:p>
-      <w:pPr>
-        <w:spacing w:after="60"/>
-        <w:ind w:left="403" w:hanging="403"/>
-      </w:pPr>
-      <w:r>
-        <w:rPr>
-          <w:b/>
-          <w:color w:val="B0501C"/>
-          <w:sz w:val="21"/>
-        </w:rPr>
-        <w:t>1.</w:t>
-        <w:tab/>
-      </w:r>
-      <w:r>
-        <w:rPr>
-          <w:color w:val="221B14"/>
-          <w:sz w:val="21"/>
-        </w:rPr>
-        <w:t>Go to app.revenuecat.com and sign up with the same business email used for the app stores.</w:t>
-      </w:r>
-    </w:p>
-    <w:p>
-      <w:pPr>
-        <w:spacing w:after="60"/>
-        <w:ind w:left="403" w:hanging="403"/>
-      </w:pPr>
-      <w:r>
-        <w:rPr>
-          <w:b/>
-          <w:color w:val="B0501C"/>
-          <w:sz w:val="21"/>
-        </w:rPr>
-        <w:t>2.</w:t>
-        <w:tab/>
-      </w:r>
-      <w:r>
-        <w:rPr>
-          <w:color w:val="221B14"/>
-          <w:sz w:val="21"/>
-        </w:rPr>
-        <w:t>Create a new Project (e.g. "Entertainment Power Players").</w:t>
-      </w:r>
-    </w:p>
-    <w:p>
-      <w:pPr>
-        <w:spacing w:after="60"/>
-        <w:ind w:left="403" w:hanging="403"/>
-      </w:pPr>
-      <w:r>
-        <w:rPr>
-          <w:b/>
-          <w:color w:val="B0501C"/>
-          <w:sz w:val="21"/>
-        </w:rPr>
-        <w:t>3.</w:t>
-        <w:tab/>
-      </w:r>
-      <w:r>
-        <w:rPr>
-          <w:color w:val="221B14"/>
-          <w:sz w:val="21"/>
-        </w:rPr>
-        <w:t>Under Project Settings → Integrations, connect Apple App Store Connect (needs an API key generated from your App Store Connect account — I can walk you through generating this, or do it myself once you've given me App Manager access from item 1) and Google Play (needs a service account JSON file generated from Play Console — same offer applies).</w:t>
-      </w:r>
-    </w:p>
-    <w:p>
-      <w:pPr>
-        <w:spacing w:after="60"/>
-        <w:ind w:left="403" w:hanging="403"/>
-      </w:pPr>
-      <w:r>
-        <w:rPr>
-          <w:b/>
-          <w:color w:val="B0501C"/>
-          <w:sz w:val="21"/>
-        </w:rPr>
-        <w:t>4.</w:t>
-        <w:tab/>
-      </w:r>
-      <w:r>
-        <w:rPr>
-          <w:color w:val="221B14"/>
-          <w:sz w:val="21"/>
-        </w:rPr>
-        <w:t>Invite me to the RevenueCat project as an Admin or Collaborator (Project Settings → Members) so I can configure the actual subscription products and paywall.</w:t>
-      </w:r>
-    </w:p>
-    <w:p>
-      <w:pPr>
-        <w:spacing w:before="200" w:after="40"/>
-      </w:pPr>
-      <w:r>
-        <w:rPr>
-          <w:b/>
-          <w:color w:val="221B14"/>
-          <w:sz w:val="22"/>
-        </w:rPr>
-        <w:t>What to send me once done</w:t>
-      </w:r>
-    </w:p>
-    <w:p>
-      <w:pPr>
-        <w:pStyle w:val="ListBullet"/>
-        <w:spacing w:after="60"/>
-      </w:pPr>
-      <w:r>
-        <w:rPr>
-          <w:color w:val="221B14"/>
-          <w:sz w:val="21"/>
-        </w:rPr>
-        <w:t>Confirmation the RevenueCat project exists and is connected to both stores.</w:t>
-      </w:r>
-    </w:p>
-    <w:p>
-      <w:pPr>
-        <w:pStyle w:val="ListBullet"/>
-        <w:spacing w:after="60"/>
-      </w:pPr>
-      <w:r>
-        <w:rPr>
-          <w:color w:val="221B14"/>
-          <w:sz w:val="21"/>
-        </w:rPr>
-        <w:t>Confirmation you've invited me as a Collaborator/Admin — I'll take it from there for the actual subscription product setup.</w:t>
-      </w:r>
-    </w:p>
-    <w:p>
       <w:pPr>
         <w:spacing w:before="40" w:after="280"/>
         <w:pBdr>
@@ -1067,7 +773,7 @@
           <w:color w:val="B0501C"/>
           <w:sz w:val="30"/>
         </w:rPr>
-        <w:t>That's everything that needs your payment</w:t>
+        <w:t>Everything else, handled and transferred at delivery</w:t>
       </w:r>
     </w:p>
     <w:p>
@@ -1081,7 +787,7 @@
           <w:color w:val="221B14"/>
           <w:sz w:val="22"/>
         </w:rPr>
-        <w:t>Everything else the app depends on right now (the backend database, "Continue with Google" login, the privacy policy text) is either free or already handled on my end while I build — I'll bring those to you separately, closer to launch, when there's something concrete for you to review rather than just an account to create.</w:t>
+        <w:t>The subscription/paywall system (RevenueCat), the backend database (Supabase), "Continue with Google" login, and the admin panel's hosting are all things I set up under my own accounts while building, and hand over to you as part of final delivery — the same way a contractor hands over the keys at the end of a job, not partway through. None of these cost anything to set up, and none of them hold your money or banking details — actual payments and payouts run through Apple and Google directly, into whatever bank details you add inside App Store Connect and Play Console once items 1 and 2 above are set up.</w:t>
       </w:r>
     </w:p>
     <w:p>
@@ -1095,7 +801,7 @@
           <w:color w:val="221B14"/>
           <w:sz w:val="22"/>
         </w:rPr>
-        <w:t>Start with Apple Developer and Google Play Console — they take the longest to verify and RevenueCat can't be finished until both are approved.</w:t>
+        <w:t>A couple of small things not covered here — the privacy policy text and a support email, plus app icon/store screenshots — I'll ask you for closer to launch, since there's nothing to review yet.</w:t>
       </w:r>
     </w:p>
     <w:p>

</xml_diff>